<commit_message>
Update Kompleksowy SQL Server - plan.docx
</commit_message>
<xml_diff>
--- a/00 - Setup/Kompleksowy SQL Server - plan.docx
+++ b/00 - Setup/Kompleksowy SQL Server - plan.docx
@@ -2139,17 +2139,19 @@
         <w:ind w:left="870"/>
         <w:rPr>
           <w:rFonts w:ascii="Montserrat" w:eastAsia="Times New Roman" w:hAnsi="Montserrat" w:cs="Times New Roman"/>
-          <w:color w:val="000000"/>
-          <w:kern w:val="0"/>
-          <w:sz w:val="26"/>
-          <w:szCs w:val="26"/>
-          <w:lang w:eastAsia="pl-PL"/>
-          <w14:ligatures w14:val="none"/>
-        </w:rPr>
-      </w:pPr>
-      <w:r>
-        <w:rPr>
-          <w:rFonts w:ascii="Montserrat" w:eastAsia="Times New Roman" w:hAnsi="Montserrat" w:cs="Times New Roman"/>
+          <w:strike/>
+          <w:color w:val="000000"/>
+          <w:kern w:val="0"/>
+          <w:sz w:val="26"/>
+          <w:szCs w:val="26"/>
+          <w:lang w:eastAsia="pl-PL"/>
+          <w14:ligatures w14:val="none"/>
+        </w:rPr>
+      </w:pPr>
+      <w:r>
+        <w:rPr>
+          <w:rFonts w:ascii="Montserrat" w:eastAsia="Times New Roman" w:hAnsi="Montserrat" w:cs="Times New Roman"/>
+          <w:strike/>
           <w:color w:val="000000"/>
           <w:kern w:val="0"/>
           <w:sz w:val="26"/>
@@ -2170,17 +2172,19 @@
         <w:ind w:left="1965"/>
         <w:rPr>
           <w:rFonts w:ascii="Montserrat" w:eastAsia="Times New Roman" w:hAnsi="Montserrat" w:cs="Times New Roman"/>
-          <w:color w:val="000000"/>
-          <w:kern w:val="0"/>
-          <w:sz w:val="26"/>
-          <w:szCs w:val="26"/>
-          <w:lang w:eastAsia="pl-PL"/>
-          <w14:ligatures w14:val="none"/>
-        </w:rPr>
-      </w:pPr>
-      <w:r>
-        <w:rPr>
-          <w:rFonts w:ascii="Montserrat" w:eastAsia="Times New Roman" w:hAnsi="Montserrat" w:cs="Times New Roman"/>
+          <w:strike/>
+          <w:color w:val="000000"/>
+          <w:kern w:val="0"/>
+          <w:sz w:val="26"/>
+          <w:szCs w:val="26"/>
+          <w:lang w:eastAsia="pl-PL"/>
+          <w14:ligatures w14:val="none"/>
+        </w:rPr>
+      </w:pPr>
+      <w:r>
+        <w:rPr>
+          <w:rFonts w:ascii="Montserrat" w:eastAsia="Times New Roman" w:hAnsi="Montserrat" w:cs="Times New Roman"/>
+          <w:strike/>
           <w:color w:val="000000"/>
           <w:kern w:val="0"/>
           <w:sz w:val="26"/>
@@ -2201,17 +2205,19 @@
         <w:ind w:left="1965"/>
         <w:rPr>
           <w:rFonts w:ascii="Montserrat" w:eastAsia="Times New Roman" w:hAnsi="Montserrat" w:cs="Times New Roman"/>
-          <w:color w:val="000000"/>
-          <w:kern w:val="0"/>
-          <w:sz w:val="26"/>
-          <w:szCs w:val="26"/>
-          <w:lang w:eastAsia="pl-PL"/>
-          <w14:ligatures w14:val="none"/>
-        </w:rPr>
-      </w:pPr>
-      <w:r>
-        <w:rPr>
-          <w:rFonts w:ascii="Montserrat" w:eastAsia="Times New Roman" w:hAnsi="Montserrat" w:cs="Times New Roman"/>
+          <w:strike/>
+          <w:color w:val="000000"/>
+          <w:kern w:val="0"/>
+          <w:sz w:val="26"/>
+          <w:szCs w:val="26"/>
+          <w:lang w:eastAsia="pl-PL"/>
+          <w14:ligatures w14:val="none"/>
+        </w:rPr>
+      </w:pPr>
+      <w:r>
+        <w:rPr>
+          <w:rFonts w:ascii="Montserrat" w:eastAsia="Times New Roman" w:hAnsi="Montserrat" w:cs="Times New Roman"/>
+          <w:strike/>
           <w:color w:val="000000"/>
           <w:kern w:val="0"/>
           <w:sz w:val="26"/>
@@ -2526,17 +2532,19 @@
         <w:ind w:left="870"/>
         <w:rPr>
           <w:rFonts w:ascii="Montserrat" w:eastAsia="Times New Roman" w:hAnsi="Montserrat" w:cs="Times New Roman"/>
-          <w:color w:val="000000"/>
-          <w:kern w:val="0"/>
-          <w:sz w:val="26"/>
-          <w:szCs w:val="26"/>
-          <w:lang w:eastAsia="pl-PL"/>
-          <w14:ligatures w14:val="none"/>
-        </w:rPr>
-      </w:pPr>
-      <w:r>
-        <w:rPr>
-          <w:rFonts w:ascii="Montserrat" w:eastAsia="Times New Roman" w:hAnsi="Montserrat" w:cs="Times New Roman"/>
+          <w:strike/>
+          <w:color w:val="000000"/>
+          <w:kern w:val="0"/>
+          <w:sz w:val="26"/>
+          <w:szCs w:val="26"/>
+          <w:lang w:eastAsia="pl-PL"/>
+          <w14:ligatures w14:val="none"/>
+        </w:rPr>
+      </w:pPr>
+      <w:r>
+        <w:rPr>
+          <w:rFonts w:ascii="Montserrat" w:eastAsia="Times New Roman" w:hAnsi="Montserrat" w:cs="Times New Roman"/>
+          <w:strike/>
           <w:color w:val="000000"/>
           <w:kern w:val="0"/>
           <w:sz w:val="26"/>
@@ -2557,17 +2565,19 @@
         <w:ind w:left="1965"/>
         <w:rPr>
           <w:rFonts w:ascii="Montserrat" w:eastAsia="Times New Roman" w:hAnsi="Montserrat" w:cs="Times New Roman"/>
-          <w:color w:val="000000"/>
-          <w:kern w:val="0"/>
-          <w:sz w:val="26"/>
-          <w:szCs w:val="26"/>
-          <w:lang w:eastAsia="pl-PL"/>
-          <w14:ligatures w14:val="none"/>
-        </w:rPr>
-      </w:pPr>
-      <w:r>
-        <w:rPr>
-          <w:rFonts w:ascii="Montserrat" w:eastAsia="Times New Roman" w:hAnsi="Montserrat" w:cs="Times New Roman"/>
+          <w:strike/>
+          <w:color w:val="000000"/>
+          <w:kern w:val="0"/>
+          <w:sz w:val="26"/>
+          <w:szCs w:val="26"/>
+          <w:lang w:eastAsia="pl-PL"/>
+          <w14:ligatures w14:val="none"/>
+        </w:rPr>
+      </w:pPr>
+      <w:r>
+        <w:rPr>
+          <w:rFonts w:ascii="Montserrat" w:eastAsia="Times New Roman" w:hAnsi="Montserrat" w:cs="Times New Roman"/>
+          <w:strike/>
           <w:color w:val="000000"/>
           <w:kern w:val="0"/>
           <w:sz w:val="26"/>
@@ -2588,17 +2598,19 @@
         <w:ind w:left="1965"/>
         <w:rPr>
           <w:rFonts w:ascii="Montserrat" w:eastAsia="Times New Roman" w:hAnsi="Montserrat" w:cs="Times New Roman"/>
-          <w:color w:val="000000"/>
-          <w:kern w:val="0"/>
-          <w:sz w:val="26"/>
-          <w:szCs w:val="26"/>
-          <w:lang w:eastAsia="pl-PL"/>
-          <w14:ligatures w14:val="none"/>
-        </w:rPr>
-      </w:pPr>
-      <w:r>
-        <w:rPr>
-          <w:rFonts w:ascii="Montserrat" w:eastAsia="Times New Roman" w:hAnsi="Montserrat" w:cs="Times New Roman"/>
+          <w:strike/>
+          <w:color w:val="000000"/>
+          <w:kern w:val="0"/>
+          <w:sz w:val="26"/>
+          <w:szCs w:val="26"/>
+          <w:lang w:eastAsia="pl-PL"/>
+          <w14:ligatures w14:val="none"/>
+        </w:rPr>
+      </w:pPr>
+      <w:r>
+        <w:rPr>
+          <w:rFonts w:ascii="Montserrat" w:eastAsia="Times New Roman" w:hAnsi="Montserrat" w:cs="Times New Roman"/>
+          <w:strike/>
           <w:color w:val="000000"/>
           <w:kern w:val="0"/>
           <w:sz w:val="26"/>
@@ -2619,17 +2631,19 @@
         <w:ind w:left="1965"/>
         <w:rPr>
           <w:rFonts w:ascii="Montserrat" w:eastAsia="Times New Roman" w:hAnsi="Montserrat" w:cs="Times New Roman"/>
-          <w:color w:val="000000"/>
-          <w:kern w:val="0"/>
-          <w:sz w:val="26"/>
-          <w:szCs w:val="26"/>
-          <w:lang w:eastAsia="pl-PL"/>
-          <w14:ligatures w14:val="none"/>
-        </w:rPr>
-      </w:pPr>
-      <w:r>
-        <w:rPr>
-          <w:rFonts w:ascii="Montserrat" w:eastAsia="Times New Roman" w:hAnsi="Montserrat" w:cs="Times New Roman"/>
+          <w:strike/>
+          <w:color w:val="000000"/>
+          <w:kern w:val="0"/>
+          <w:sz w:val="26"/>
+          <w:szCs w:val="26"/>
+          <w:lang w:eastAsia="pl-PL"/>
+          <w14:ligatures w14:val="none"/>
+        </w:rPr>
+      </w:pPr>
+      <w:r>
+        <w:rPr>
+          <w:rFonts w:ascii="Montserrat" w:eastAsia="Times New Roman" w:hAnsi="Montserrat" w:cs="Times New Roman"/>
+          <w:strike/>
           <w:color w:val="000000"/>
           <w:kern w:val="0"/>
           <w:sz w:val="26"/>
@@ -2650,6 +2664,7 @@
         <w:ind w:left="1965"/>
         <w:rPr>
           <w:rFonts w:ascii="Montserrat" w:eastAsia="Times New Roman" w:hAnsi="Montserrat" w:cs="Times New Roman"/>
+          <w:strike/>
           <w:color w:val="000000"/>
           <w:kern w:val="0"/>
           <w:sz w:val="26"/>
@@ -2662,6 +2677,7 @@
       <w:r>
         <w:rPr>
           <w:rFonts w:ascii="Montserrat" w:eastAsia="Times New Roman" w:hAnsi="Montserrat" w:cs="Times New Roman"/>
+          <w:strike/>
           <w:color w:val="000000"/>
           <w:kern w:val="0"/>
           <w:sz w:val="26"/>
@@ -2675,6 +2691,7 @@
       <w:r>
         <w:rPr>
           <w:rFonts w:ascii="Montserrat" w:eastAsia="Times New Roman" w:hAnsi="Montserrat" w:cs="Times New Roman"/>
+          <w:strike/>
           <w:color w:val="000000"/>
           <w:kern w:val="0"/>
           <w:sz w:val="26"/>
@@ -2688,6 +2705,7 @@
       <w:r>
         <w:rPr>
           <w:rFonts w:ascii="Montserrat" w:eastAsia="Times New Roman" w:hAnsi="Montserrat" w:cs="Times New Roman"/>
+          <w:strike/>
           <w:color w:val="000000"/>
           <w:kern w:val="0"/>
           <w:sz w:val="26"/>

</xml_diff>